<commit_message>
Atualiza currículo em Português e adiciona botão de download em Inglês
Sincroniza a página Sobre com o CV mais recente: novos bullets do
estágio na Going2, PendurAi em produção com integração Asaas, e
adiciona os projetos MarcAi e Life OS. Inclui Google Cloud nas
competências e um botão de download do currículo em inglês.

Co-Authored-By: Claude Sonnet 5 <noreply@anthropic.com>
</commit_message>
<xml_diff>
--- a/public/curriculo-vinnicius-santos.docx
+++ b/public/curriculo-vinnicius-santos.docx
@@ -58,19 +58,7 @@
           <w:rPr>
             <w:rStyle w:val="Hyperlink"/>
           </w:rPr>
-          <w:t>https://www.linkedin.com/in</w:t>
-        </w:r>
-        <w:r>
-          <w:rPr>
-            <w:rStyle w:val="Hyperlink"/>
-          </w:rPr>
-          <w:t>/</w:t>
-        </w:r>
-        <w:r>
-          <w:rPr>
-            <w:rStyle w:val="Hyperlink"/>
-          </w:rPr>
-          <w:t>vinnisantos</w:t>
+          <w:t>https://www.linkedin.com/in/vinnisantos</w:t>
         </w:r>
       </w:hyperlink>
       <w:r>
@@ -85,19 +73,7 @@
           <w:rPr>
             <w:rStyle w:val="Hyperlink"/>
           </w:rPr>
-          <w:t>www.github.com</w:t>
-        </w:r>
-        <w:r>
-          <w:rPr>
-            <w:rStyle w:val="Hyperlink"/>
-          </w:rPr>
-          <w:t>/</w:t>
-        </w:r>
-        <w:r>
-          <w:rPr>
-            <w:rStyle w:val="Hyperlink"/>
-          </w:rPr>
-          <w:t>vinnisntos</w:t>
+          <w:t>www.github.com/vinnisntos</w:t>
         </w:r>
       </w:hyperlink>
     </w:p>
@@ -313,7 +289,13 @@
       </w:r>
       <w:proofErr w:type="spellEnd"/>
       <w:r>
-        <w:t>, Azure (Conceitos/Integração).</w:t>
+        <w:t>, Azure (Conceitos/Integração)</w:t>
+      </w:r>
+      <w:r>
+        <w:t>, Google Cloud Console, Google CLI</w:t>
+      </w:r>
+      <w:r>
+        <w:t>.</w:t>
       </w:r>
     </w:p>
     <w:p>
@@ -372,6 +354,8 @@
     <w:p>
       <w:pPr>
         <w:rPr>
+          <w:b/>
+          <w:bCs/>
           <w:sz w:val="28"/>
           <w:szCs w:val="28"/>
         </w:rPr>
@@ -385,6 +369,225 @@
         </w:rPr>
         <w:t>EXPERIÊNCIA PROFISSIONAL</w:t>
       </w:r>
+    </w:p>
+    <w:p>
+      <w:pPr>
+        <w:rPr>
+          <w:b/>
+          <w:bCs/>
+        </w:rPr>
+      </w:pPr>
+    </w:p>
+    <w:p>
+      <w:r>
+        <w:rPr>
+          <w:b/>
+          <w:bCs/>
+        </w:rPr>
+        <w:t xml:space="preserve">Going2 Corporation </w:t>
+      </w:r>
+      <w:r>
+        <w:rPr>
+          <w:i/>
+          <w:iCs/>
+        </w:rPr>
+        <w:t xml:space="preserve">Estagiário </w:t>
+      </w:r>
+      <w:proofErr w:type="spellStart"/>
+      <w:r>
+        <w:rPr>
+          <w:i/>
+          <w:iCs/>
+        </w:rPr>
+        <w:t>HelpDesk</w:t>
+      </w:r>
+      <w:proofErr w:type="spellEnd"/>
+      <w:r>
+        <w:rPr>
+          <w:i/>
+          <w:iCs/>
+        </w:rPr>
+        <w:t>/</w:t>
+      </w:r>
+      <w:proofErr w:type="spellStart"/>
+      <w:r>
+        <w:rPr>
+          <w:i/>
+          <w:iCs/>
+        </w:rPr>
+        <w:t>DevOps</w:t>
+      </w:r>
+      <w:proofErr w:type="spellEnd"/>
+      <w:r>
+        <w:rPr>
+          <w:i/>
+          <w:iCs/>
+        </w:rPr>
+        <w:t xml:space="preserve"> TI Interno </w:t>
+      </w:r>
+      <w:r>
+        <w:t>| 07/2026 – Atual</w:t>
+      </w:r>
+    </w:p>
+    <w:p>
+      <w:pPr>
+        <w:pStyle w:val="NormalWeb"/>
+        <w:numPr>
+          <w:ilvl w:val="0"/>
+          <w:numId w:val="1"/>
+        </w:numPr>
+        <w:rPr>
+          <w:rFonts w:asciiTheme="minorHAnsi" w:hAnsiTheme="minorHAnsi"/>
+        </w:rPr>
+      </w:pPr>
+      <w:r>
+        <w:rPr>
+          <w:rFonts w:asciiTheme="minorHAnsi" w:hAnsiTheme="minorHAnsi"/>
+        </w:rPr>
+        <w:t xml:space="preserve">Gestão de TI e governança, responsável pelo desenvolvimento ponta a ponta de um Portal interno (Next.js, </w:t>
+      </w:r>
+      <w:proofErr w:type="spellStart"/>
+      <w:r>
+        <w:rPr>
+          <w:rFonts w:asciiTheme="minorHAnsi" w:hAnsiTheme="minorHAnsi"/>
+        </w:rPr>
+        <w:t>Supabase</w:t>
+      </w:r>
+      <w:proofErr w:type="spellEnd"/>
+      <w:r>
+        <w:rPr>
+          <w:rFonts w:asciiTheme="minorHAnsi" w:hAnsiTheme="minorHAnsi"/>
+        </w:rPr>
+        <w:t>, AWS EC2) para controle de acessos e auditoria do catálogo de sistemas.</w:t>
+      </w:r>
+      <w:r>
+        <w:rPr>
+          <w:rFonts w:asciiTheme="minorHAnsi" w:hAnsiTheme="minorHAnsi"/>
+        </w:rPr>
+        <w:br/>
+      </w:r>
+    </w:p>
+    <w:p>
+      <w:pPr>
+        <w:pStyle w:val="NormalWeb"/>
+        <w:numPr>
+          <w:ilvl w:val="0"/>
+          <w:numId w:val="1"/>
+        </w:numPr>
+        <w:rPr>
+          <w:rFonts w:asciiTheme="minorHAnsi" w:hAnsiTheme="minorHAnsi"/>
+        </w:rPr>
+      </w:pPr>
+      <w:r>
+        <w:rPr>
+          <w:rFonts w:asciiTheme="minorHAnsi" w:hAnsiTheme="minorHAnsi"/>
+        </w:rPr>
+        <w:t>Automação e inovação tecnológica, participando ativamente da criação e implementação de projetos internos utilizando Inteligência Artificial para otimização de processo</w:t>
+      </w:r>
+      <w:r>
+        <w:rPr>
+          <w:rFonts w:asciiTheme="minorHAnsi" w:hAnsiTheme="minorHAnsi"/>
+        </w:rPr>
+        <w:t>s</w:t>
+      </w:r>
+      <w:r>
+        <w:rPr>
+          <w:rFonts w:asciiTheme="minorHAnsi" w:hAnsiTheme="minorHAnsi"/>
+        </w:rPr>
+        <w:br/>
+      </w:r>
+    </w:p>
+    <w:p>
+      <w:pPr>
+        <w:pStyle w:val="NormalWeb"/>
+        <w:numPr>
+          <w:ilvl w:val="0"/>
+          <w:numId w:val="1"/>
+        </w:numPr>
+        <w:rPr>
+          <w:rFonts w:asciiTheme="minorHAnsi" w:hAnsiTheme="minorHAnsi"/>
+        </w:rPr>
+      </w:pPr>
+      <w:r>
+        <w:rPr>
+          <w:rFonts w:asciiTheme="minorHAnsi" w:hAnsiTheme="minorHAnsi"/>
+        </w:rPr>
+        <w:t xml:space="preserve">Responsável pelas rotinas de </w:t>
+      </w:r>
+      <w:proofErr w:type="spellStart"/>
+      <w:r>
+        <w:rPr>
+          <w:rFonts w:asciiTheme="minorHAnsi" w:hAnsiTheme="minorHAnsi"/>
+        </w:rPr>
+        <w:t>DevOps</w:t>
+      </w:r>
+      <w:proofErr w:type="spellEnd"/>
+      <w:r>
+        <w:rPr>
+          <w:rFonts w:asciiTheme="minorHAnsi" w:hAnsiTheme="minorHAnsi"/>
+        </w:rPr>
+        <w:t>, atuando no gerenciamento de infraestrutura em nuvem, configuração de servidores (</w:t>
+      </w:r>
+      <w:proofErr w:type="spellStart"/>
+      <w:r>
+        <w:rPr>
+          <w:rFonts w:asciiTheme="minorHAnsi" w:hAnsiTheme="minorHAnsi"/>
+        </w:rPr>
+        <w:t>Nginx</w:t>
+      </w:r>
+      <w:proofErr w:type="spellEnd"/>
+      <w:r>
+        <w:rPr>
+          <w:rFonts w:asciiTheme="minorHAnsi" w:hAnsiTheme="minorHAnsi"/>
+        </w:rPr>
+        <w:t>/PM2) e manutenção de ambientes para garantir a alta disponibilidade das aplicações</w:t>
+      </w:r>
+      <w:r>
+        <w:rPr>
+          <w:rFonts w:asciiTheme="minorHAnsi" w:hAnsiTheme="minorHAnsi"/>
+        </w:rPr>
+        <w:br/>
+      </w:r>
+    </w:p>
+    <w:p>
+      <w:pPr>
+        <w:pStyle w:val="NormalWeb"/>
+        <w:numPr>
+          <w:ilvl w:val="0"/>
+          <w:numId w:val="1"/>
+        </w:numPr>
+        <w:rPr>
+          <w:rFonts w:asciiTheme="minorHAnsi" w:hAnsiTheme="minorHAnsi"/>
+        </w:rPr>
+      </w:pPr>
+      <w:r>
+        <w:rPr>
+          <w:rFonts w:asciiTheme="minorHAnsi" w:hAnsiTheme="minorHAnsi"/>
+        </w:rPr>
+        <w:t xml:space="preserve">Suporte técnico de </w:t>
+      </w:r>
+      <w:proofErr w:type="spellStart"/>
+      <w:r>
+        <w:rPr>
+          <w:rFonts w:asciiTheme="minorHAnsi" w:hAnsiTheme="minorHAnsi"/>
+        </w:rPr>
+        <w:t>HelpDesk</w:t>
+      </w:r>
+      <w:proofErr w:type="spellEnd"/>
+      <w:r>
+        <w:rPr>
+          <w:rFonts w:asciiTheme="minorHAnsi" w:hAnsiTheme="minorHAnsi"/>
+        </w:rPr>
+        <w:t>, realizando atendimento contínuo, resolução ágil de incidentes e manutenção preventiva e corretiva da infraestrutura tecnológica corporativa.</w:t>
+      </w:r>
+    </w:p>
+    <w:p>
+      <w:pPr>
+        <w:rPr>
+          <w:b/>
+          <w:bCs/>
+        </w:rPr>
+      </w:pPr>
     </w:p>
     <w:p>
       <w:r>
@@ -453,12 +656,16 @@
       </w:r>
     </w:p>
     <w:p/>
-    <w:p>
-      <w:r>
-        <w:rPr>
-          <w:b/>
-          <w:bCs/>
-        </w:rPr>
+    <w:p/>
+    <w:p/>
+    <w:p/>
+    <w:p>
+      <w:r>
+        <w:rPr>
+          <w:b/>
+          <w:bCs/>
+        </w:rPr>
+        <w:lastRenderedPageBreak/>
         <w:t>MDA Do Brasil Indústria e Comércio</w:t>
       </w:r>
       <w:r>
@@ -512,6 +719,8 @@
     <w:p>
       <w:pPr>
         <w:rPr>
+          <w:b/>
+          <w:bCs/>
           <w:sz w:val="28"/>
           <w:szCs w:val="28"/>
         </w:rPr>
@@ -523,25 +732,670 @@
           <w:sz w:val="28"/>
           <w:szCs w:val="28"/>
         </w:rPr>
-        <w:t>FORMAÇÃO ACADÊMICA</w:t>
-      </w:r>
-    </w:p>
-    <w:p>
-      <w:r>
-        <w:rPr>
-          <w:b/>
-          <w:bCs/>
-        </w:rPr>
-        <w:t>Universidade Paulista (UNIP)</w:t>
-      </w:r>
-      <w:r>
-        <w:t xml:space="preserve"> </w:t>
+        <w:br/>
+      </w:r>
+      <w:r>
+        <w:rPr>
+          <w:b/>
+          <w:bCs/>
+          <w:sz w:val="28"/>
+          <w:szCs w:val="28"/>
+        </w:rPr>
+        <w:br/>
+      </w:r>
+      <w:r>
+        <w:rPr>
+          <w:b/>
+          <w:bCs/>
+          <w:sz w:val="28"/>
+          <w:szCs w:val="28"/>
+        </w:rPr>
+        <w:br/>
+      </w:r>
+      <w:r>
+        <w:rPr>
+          <w:b/>
+          <w:bCs/>
+          <w:sz w:val="28"/>
+          <w:szCs w:val="28"/>
+        </w:rPr>
+        <w:t>PROJETOS EM DESTAQUE</w:t>
+      </w:r>
+    </w:p>
+    <w:p>
+      <w:pPr>
+        <w:rPr>
+          <w:b/>
+          <w:bCs/>
+          <w:sz w:val="28"/>
+          <w:szCs w:val="28"/>
+        </w:rPr>
+      </w:pPr>
+    </w:p>
+    <w:p>
+      <w:proofErr w:type="spellStart"/>
+      <w:r>
+        <w:rPr>
+          <w:b/>
+          <w:bCs/>
+        </w:rPr>
+        <w:t>PendurAi</w:t>
+      </w:r>
+      <w:proofErr w:type="spellEnd"/>
+      <w:r>
+        <w:t xml:space="preserve"> – ERP e PDV (SaaS) | </w:t>
       </w:r>
       <w:r>
         <w:rPr>
           <w:i/>
           <w:iCs/>
         </w:rPr>
+        <w:t>pendurai.vinnisantos.com.br</w:t>
+      </w:r>
+    </w:p>
+    <w:p>
+      <w:pPr>
+        <w:numPr>
+          <w:ilvl w:val="0"/>
+          <w:numId w:val="6"/>
+        </w:numPr>
+      </w:pPr>
+      <w:r>
+        <w:t xml:space="preserve">Arquitetura e desenvolvimento ponta a ponta de uma plataforma </w:t>
+      </w:r>
+      <w:proofErr w:type="spellStart"/>
+      <w:r>
+        <w:t>multi-tenant</w:t>
+      </w:r>
+      <w:proofErr w:type="spellEnd"/>
+      <w:r>
+        <w:t xml:space="preserve"> para gestão de pequenos mercados.</w:t>
+      </w:r>
+    </w:p>
+    <w:p>
+      <w:pPr>
+        <w:numPr>
+          <w:ilvl w:val="0"/>
+          <w:numId w:val="6"/>
+        </w:numPr>
+      </w:pPr>
+      <w:r>
+        <w:t xml:space="preserve">Integração de pagamentos recorrentes via API do </w:t>
+      </w:r>
+      <w:proofErr w:type="spellStart"/>
+      <w:r>
+        <w:t>Asaas</w:t>
+      </w:r>
+      <w:proofErr w:type="spellEnd"/>
+      <w:r>
+        <w:t>.</w:t>
+      </w:r>
+    </w:p>
+    <w:p>
+      <w:pPr>
+        <w:numPr>
+          <w:ilvl w:val="0"/>
+          <w:numId w:val="6"/>
+        </w:numPr>
+      </w:pPr>
+      <w:r>
+        <w:t xml:space="preserve">Stack: C# (ASP.NET Core </w:t>
+      </w:r>
+      <w:proofErr w:type="spellStart"/>
+      <w:r>
+        <w:t>Razor</w:t>
+      </w:r>
+      <w:proofErr w:type="spellEnd"/>
+      <w:r>
+        <w:t xml:space="preserve"> Pages), </w:t>
+      </w:r>
+      <w:proofErr w:type="spellStart"/>
+      <w:r>
+        <w:t>micro-ORM</w:t>
+      </w:r>
+      <w:proofErr w:type="spellEnd"/>
+      <w:r>
+        <w:t xml:space="preserve"> </w:t>
+      </w:r>
+      <w:proofErr w:type="spellStart"/>
+      <w:r>
+        <w:t>Dapper</w:t>
+      </w:r>
+      <w:proofErr w:type="spellEnd"/>
+      <w:r>
+        <w:t>, PostgreSQL (</w:t>
+      </w:r>
+      <w:proofErr w:type="spellStart"/>
+      <w:r>
+        <w:t>Supabase</w:t>
+      </w:r>
+      <w:proofErr w:type="spellEnd"/>
+      <w:r>
+        <w:t xml:space="preserve">) e </w:t>
+      </w:r>
+      <w:proofErr w:type="spellStart"/>
+      <w:r>
+        <w:t>deploy</w:t>
+      </w:r>
+      <w:proofErr w:type="spellEnd"/>
+      <w:r>
+        <w:t xml:space="preserve"> em produção na AWS EC2.</w:t>
+      </w:r>
+      <w:r>
+        <w:br/>
+      </w:r>
+    </w:p>
+    <w:p>
+      <w:r>
+        <w:rPr>
+          <w:b/>
+          <w:bCs/>
+        </w:rPr>
+        <w:t>Mocidade 015</w:t>
+      </w:r>
+      <w:r>
+        <w:t xml:space="preserve"> – Sistema de Reservas </w:t>
+      </w:r>
+      <w:r>
+        <w:t xml:space="preserve">| </w:t>
+      </w:r>
+      <w:r>
+        <w:rPr>
+          <w:i/>
+          <w:iCs/>
+        </w:rPr>
+        <w:t>mocidade015.vinnisantos.com.br</w:t>
+      </w:r>
+    </w:p>
+    <w:p>
+      <w:pPr>
+        <w:numPr>
+          <w:ilvl w:val="0"/>
+          <w:numId w:val="7"/>
+        </w:numPr>
+      </w:pPr>
+      <w:r>
+        <w:t>Engenharia de um sistema online para reserva de passagens de ônibus, suportando registro em lote de passageiros.</w:t>
+      </w:r>
+    </w:p>
+    <w:p>
+      <w:pPr>
+        <w:numPr>
+          <w:ilvl w:val="0"/>
+          <w:numId w:val="7"/>
+        </w:numPr>
+      </w:pPr>
+      <w:r>
+        <w:t xml:space="preserve">Implementação de pipeline automatizada de CI/CD para </w:t>
+      </w:r>
+      <w:proofErr w:type="spellStart"/>
+      <w:r>
+        <w:t>deploy</w:t>
+      </w:r>
+      <w:proofErr w:type="spellEnd"/>
+      <w:r>
+        <w:t xml:space="preserve"> contínuo.</w:t>
+      </w:r>
+    </w:p>
+    <w:p>
+      <w:pPr>
+        <w:numPr>
+          <w:ilvl w:val="0"/>
+          <w:numId w:val="7"/>
+        </w:numPr>
+        <w:rPr>
+          <w:lang w:val="en-US"/>
+        </w:rPr>
+      </w:pPr>
+      <w:r>
+        <w:rPr>
+          <w:lang w:val="en-US"/>
+        </w:rPr>
+        <w:t>Stack: C# (.NET 10), Entity Framework Core e GitHub Actions.</w:t>
+      </w:r>
+      <w:r>
+        <w:rPr>
+          <w:lang w:val="en-US"/>
+        </w:rPr>
+        <w:br/>
+      </w:r>
+      <w:r>
+        <w:rPr>
+          <w:lang w:val="en-US"/>
+        </w:rPr>
+        <w:br/>
+      </w:r>
+    </w:p>
+    <w:p>
+      <w:pPr>
+        <w:rPr>
+          <w:lang w:val="en-US"/>
+        </w:rPr>
+      </w:pPr>
+    </w:p>
+    <w:p>
+      <w:pPr>
+        <w:rPr>
+          <w:lang w:val="en-US"/>
+        </w:rPr>
+      </w:pPr>
+    </w:p>
+    <w:p>
+      <w:pPr>
+        <w:rPr>
+          <w:lang w:val="en-US"/>
+        </w:rPr>
+      </w:pPr>
+      <w:r>
+        <w:rPr>
+          <w:lang w:val="en-US"/>
+        </w:rPr>
+        <w:br/>
+      </w:r>
+    </w:p>
+    <w:p>
+      <w:pPr>
+        <w:rPr>
+          <w:i/>
+          <w:iCs/>
+        </w:rPr>
+      </w:pPr>
+      <w:proofErr w:type="spellStart"/>
+      <w:r>
+        <w:rPr>
+          <w:b/>
+          <w:bCs/>
+        </w:rPr>
+        <w:lastRenderedPageBreak/>
+        <w:t>MarcAi</w:t>
+      </w:r>
+      <w:proofErr w:type="spellEnd"/>
+      <w:r>
+        <w:t xml:space="preserve"> – Plataforma de Agendamento</w:t>
+      </w:r>
+      <w:r>
+        <w:t xml:space="preserve"> | </w:t>
+      </w:r>
+      <w:r>
+        <w:rPr>
+          <w:i/>
+          <w:iCs/>
+        </w:rPr>
+        <w:t>Em fase de desenvolvimento</w:t>
+      </w:r>
+    </w:p>
+    <w:p>
+      <w:pPr>
+        <w:numPr>
+          <w:ilvl w:val="0"/>
+          <w:numId w:val="8"/>
+        </w:numPr>
+      </w:pPr>
+      <w:r>
+        <w:t xml:space="preserve">Construção de aplicação </w:t>
+      </w:r>
+      <w:proofErr w:type="spellStart"/>
+      <w:r>
+        <w:t>multi-tenant</w:t>
+      </w:r>
+      <w:proofErr w:type="spellEnd"/>
+      <w:r>
+        <w:t xml:space="preserve"> voltada para salões de estética, com foco em segurança e autenticação de dois fatores (TOTP 2FA).</w:t>
+      </w:r>
+    </w:p>
+    <w:p>
+      <w:pPr>
+        <w:numPr>
+          <w:ilvl w:val="0"/>
+          <w:numId w:val="8"/>
+        </w:numPr>
+      </w:pPr>
+      <w:r>
+        <w:t>Garantia de qualidade de código através de testes unitários e conteinerização do ambiente.</w:t>
+      </w:r>
+    </w:p>
+    <w:p>
+      <w:pPr>
+        <w:numPr>
+          <w:ilvl w:val="0"/>
+          <w:numId w:val="8"/>
+        </w:numPr>
+        <w:rPr>
+          <w:lang w:val="en-US"/>
+        </w:rPr>
+      </w:pPr>
+      <w:r>
+        <w:rPr>
+          <w:lang w:val="en-US"/>
+        </w:rPr>
+        <w:t xml:space="preserve">Stack: C# (ASP.NET Core), </w:t>
+      </w:r>
+      <w:proofErr w:type="spellStart"/>
+      <w:r>
+        <w:rPr>
+          <w:lang w:val="en-US"/>
+        </w:rPr>
+        <w:t>Supabase</w:t>
+      </w:r>
+      <w:proofErr w:type="spellEnd"/>
+      <w:r>
+        <w:rPr>
+          <w:lang w:val="en-US"/>
+        </w:rPr>
+        <w:t xml:space="preserve">, </w:t>
+      </w:r>
+      <w:proofErr w:type="spellStart"/>
+      <w:r>
+        <w:rPr>
+          <w:lang w:val="en-US"/>
+        </w:rPr>
+        <w:t>xUnit</w:t>
+      </w:r>
+      <w:proofErr w:type="spellEnd"/>
+      <w:r>
+        <w:rPr>
+          <w:lang w:val="en-US"/>
+        </w:rPr>
+        <w:t xml:space="preserve"> e Docker.</w:t>
+      </w:r>
+      <w:r>
+        <w:rPr>
+          <w:lang w:val="en-US"/>
+        </w:rPr>
+        <w:br/>
+      </w:r>
+      <w:r>
+        <w:rPr>
+          <w:lang w:val="en-US"/>
+        </w:rPr>
+        <w:br/>
+      </w:r>
+    </w:p>
+    <w:p>
+      <w:r>
+        <w:rPr>
+          <w:b/>
+          <w:bCs/>
+        </w:rPr>
+        <w:t>Life OS</w:t>
+      </w:r>
+      <w:r>
+        <w:t xml:space="preserve"> – Dashboard de Gestão Pessoal | </w:t>
+      </w:r>
+      <w:r>
+        <w:rPr>
+          <w:i/>
+          <w:iCs/>
+        </w:rPr>
+        <w:t>agenda.vinnisantos.com.br</w:t>
+      </w:r>
+    </w:p>
+    <w:p>
+      <w:pPr>
+        <w:numPr>
+          <w:ilvl w:val="0"/>
+          <w:numId w:val="9"/>
+        </w:numPr>
+      </w:pPr>
+      <w:r>
+        <w:t>Desenvolvimento de aplicação fullstack moderna para gerenciamento pessoal e produtividade.</w:t>
+      </w:r>
+    </w:p>
+    <w:p>
+      <w:pPr>
+        <w:numPr>
+          <w:ilvl w:val="0"/>
+          <w:numId w:val="9"/>
+        </w:numPr>
+      </w:pPr>
+      <w:r>
+        <w:t xml:space="preserve">Stack: Next.js 15, </w:t>
+      </w:r>
+      <w:proofErr w:type="spellStart"/>
+      <w:r>
+        <w:t>Tailwind</w:t>
+      </w:r>
+      <w:proofErr w:type="spellEnd"/>
+      <w:r>
+        <w:t xml:space="preserve"> CSS, </w:t>
+      </w:r>
+      <w:proofErr w:type="spellStart"/>
+      <w:r>
+        <w:t>Supabase</w:t>
+      </w:r>
+      <w:proofErr w:type="spellEnd"/>
+      <w:r>
+        <w:t xml:space="preserve"> </w:t>
+      </w:r>
+      <w:proofErr w:type="spellStart"/>
+      <w:r>
+        <w:t>Auth</w:t>
+      </w:r>
+      <w:proofErr w:type="spellEnd"/>
+      <w:r>
+        <w:t>, orquestrado com Docker na AWS EC2.</w:t>
+      </w:r>
+    </w:p>
+    <w:p>
+      <w:pPr>
+        <w:rPr>
+          <w:b/>
+          <w:bCs/>
+          <w:sz w:val="28"/>
+          <w:szCs w:val="28"/>
+        </w:rPr>
+      </w:pPr>
+      <w:r>
+        <w:rPr>
+          <w:b/>
+          <w:bCs/>
+          <w:sz w:val="28"/>
+          <w:szCs w:val="28"/>
+        </w:rPr>
+        <w:br/>
+      </w:r>
+      <w:r>
+        <w:rPr>
+          <w:b/>
+          <w:bCs/>
+          <w:sz w:val="28"/>
+          <w:szCs w:val="28"/>
+        </w:rPr>
+        <w:br/>
+      </w:r>
+      <w:r>
+        <w:rPr>
+          <w:b/>
+          <w:bCs/>
+          <w:sz w:val="28"/>
+          <w:szCs w:val="28"/>
+        </w:rPr>
+        <w:br/>
+      </w:r>
+      <w:r>
+        <w:rPr>
+          <w:b/>
+          <w:bCs/>
+          <w:sz w:val="28"/>
+          <w:szCs w:val="28"/>
+        </w:rPr>
+        <w:br/>
+      </w:r>
+      <w:r>
+        <w:rPr>
+          <w:b/>
+          <w:bCs/>
+          <w:sz w:val="28"/>
+          <w:szCs w:val="28"/>
+        </w:rPr>
+        <w:br/>
+      </w:r>
+      <w:r>
+        <w:rPr>
+          <w:b/>
+          <w:bCs/>
+          <w:sz w:val="28"/>
+          <w:szCs w:val="28"/>
+        </w:rPr>
+        <w:br/>
+      </w:r>
+      <w:r>
+        <w:rPr>
+          <w:b/>
+          <w:bCs/>
+          <w:sz w:val="28"/>
+          <w:szCs w:val="28"/>
+        </w:rPr>
+        <w:br/>
+      </w:r>
+      <w:r>
+        <w:rPr>
+          <w:b/>
+          <w:bCs/>
+          <w:sz w:val="28"/>
+          <w:szCs w:val="28"/>
+        </w:rPr>
+        <w:br/>
+      </w:r>
+      <w:r>
+        <w:rPr>
+          <w:b/>
+          <w:bCs/>
+          <w:sz w:val="28"/>
+          <w:szCs w:val="28"/>
+        </w:rPr>
+        <w:br/>
+      </w:r>
+      <w:r>
+        <w:rPr>
+          <w:b/>
+          <w:bCs/>
+          <w:sz w:val="28"/>
+          <w:szCs w:val="28"/>
+        </w:rPr>
+        <w:br/>
+      </w:r>
+      <w:r>
+        <w:rPr>
+          <w:b/>
+          <w:bCs/>
+          <w:sz w:val="28"/>
+          <w:szCs w:val="28"/>
+        </w:rPr>
+        <w:br/>
+      </w:r>
+      <w:r>
+        <w:rPr>
+          <w:b/>
+          <w:bCs/>
+          <w:sz w:val="28"/>
+          <w:szCs w:val="28"/>
+        </w:rPr>
+        <w:br/>
+      </w:r>
+      <w:r>
+        <w:rPr>
+          <w:b/>
+          <w:bCs/>
+          <w:sz w:val="28"/>
+          <w:szCs w:val="28"/>
+        </w:rPr>
+        <w:br/>
+      </w:r>
+      <w:r>
+        <w:rPr>
+          <w:b/>
+          <w:bCs/>
+          <w:sz w:val="28"/>
+          <w:szCs w:val="28"/>
+        </w:rPr>
+        <w:br/>
+      </w:r>
+    </w:p>
+    <w:p>
+      <w:pPr>
+        <w:rPr>
+          <w:b/>
+          <w:bCs/>
+          <w:sz w:val="28"/>
+          <w:szCs w:val="28"/>
+        </w:rPr>
+      </w:pPr>
+      <w:r>
+        <w:rPr>
+          <w:b/>
+          <w:bCs/>
+          <w:sz w:val="28"/>
+          <w:szCs w:val="28"/>
+        </w:rPr>
+        <w:br/>
+      </w:r>
+    </w:p>
+    <w:p>
+      <w:pPr>
+        <w:rPr>
+          <w:b/>
+          <w:bCs/>
+          <w:sz w:val="28"/>
+          <w:szCs w:val="28"/>
+        </w:rPr>
+      </w:pPr>
+    </w:p>
+    <w:p>
+      <w:pPr>
+        <w:rPr>
+          <w:b/>
+          <w:bCs/>
+          <w:sz w:val="28"/>
+          <w:szCs w:val="28"/>
+        </w:rPr>
+      </w:pPr>
+      <w:r>
+        <w:rPr>
+          <w:b/>
+          <w:bCs/>
+          <w:sz w:val="28"/>
+          <w:szCs w:val="28"/>
+        </w:rPr>
+        <w:br/>
+      </w:r>
+    </w:p>
+    <w:p>
+      <w:pPr>
+        <w:rPr>
+          <w:b/>
+          <w:bCs/>
+          <w:sz w:val="28"/>
+          <w:szCs w:val="28"/>
+        </w:rPr>
+      </w:pPr>
+      <w:r>
+        <w:rPr>
+          <w:b/>
+          <w:bCs/>
+          <w:sz w:val="28"/>
+          <w:szCs w:val="28"/>
+        </w:rPr>
+        <w:lastRenderedPageBreak/>
+        <w:t>FORMAÇÃO ACADÊMICA</w:t>
+      </w:r>
+    </w:p>
+    <w:p>
+      <w:r>
+        <w:rPr>
+          <w:b/>
+          <w:bCs/>
+        </w:rPr>
+        <w:t>Universidade Paulista (UNIP)</w:t>
+      </w:r>
+      <w:r>
+        <w:t xml:space="preserve"> </w:t>
+      </w:r>
+      <w:r>
+        <w:rPr>
+          <w:i/>
+          <w:iCs/>
+        </w:rPr>
         <w:t>Tecnólogo em Análise e Desenvolvimento de Sistemas</w:t>
       </w:r>
       <w:r>
@@ -560,6 +1414,161 @@
       </w:r>
       <w:r>
         <w:t xml:space="preserve"> (Cursando o 3º Semestre – Período Noturno)</w:t>
+      </w:r>
+    </w:p>
+    <w:p/>
+    <w:p/>
+    <w:p/>
+    <w:p>
+      <w:pPr>
+        <w:rPr>
+          <w:u w:val="single"/>
+        </w:rPr>
+      </w:pPr>
+    </w:p>
+    <w:p>
+      <w:pPr>
+        <w:rPr>
+          <w:b/>
+          <w:bCs/>
+          <w:sz w:val="28"/>
+          <w:szCs w:val="28"/>
+        </w:rPr>
+      </w:pPr>
+      <w:r>
+        <w:rPr>
+          <w:b/>
+          <w:bCs/>
+          <w:sz w:val="28"/>
+          <w:szCs w:val="28"/>
+        </w:rPr>
+        <w:t>CURSOS E CERTIFICAÇÕES</w:t>
+      </w:r>
+    </w:p>
+    <w:p>
+      <w:pPr>
+        <w:numPr>
+          <w:ilvl w:val="0"/>
+          <w:numId w:val="4"/>
+        </w:numPr>
+        <w:rPr>
+          <w:lang w:val="en-US"/>
+        </w:rPr>
+      </w:pPr>
+      <w:r>
+        <w:rPr>
+          <w:b/>
+          <w:bCs/>
+          <w:lang w:val="en-US"/>
+        </w:rPr>
+        <w:t>Introduction to Computer Science with Python (CS50P)</w:t>
+      </w:r>
+      <w:r>
+        <w:rPr>
+          <w:lang w:val="en-US"/>
+        </w:rPr>
+        <w:t xml:space="preserve"> – Harvard University / EdX (2024)</w:t>
+      </w:r>
+    </w:p>
+    <w:p>
+      <w:pPr>
+        <w:numPr>
+          <w:ilvl w:val="0"/>
+          <w:numId w:val="4"/>
+        </w:numPr>
+        <w:rPr>
+          <w:lang w:val="en-US"/>
+        </w:rPr>
+      </w:pPr>
+      <w:r>
+        <w:rPr>
+          <w:b/>
+          <w:bCs/>
+          <w:lang w:val="en-US"/>
+        </w:rPr>
+        <w:t>Introduction to Databases with SQL (CS50SQL)</w:t>
+      </w:r>
+      <w:r>
+        <w:rPr>
+          <w:lang w:val="en-US"/>
+        </w:rPr>
+        <w:t xml:space="preserve"> – Harvard University / EdX (Em </w:t>
+      </w:r>
+      <w:proofErr w:type="spellStart"/>
+      <w:r>
+        <w:rPr>
+          <w:lang w:val="en-US"/>
+        </w:rPr>
+        <w:t>andamento</w:t>
+      </w:r>
+      <w:proofErr w:type="spellEnd"/>
+      <w:r>
+        <w:rPr>
+          <w:lang w:val="en-US"/>
+        </w:rPr>
+        <w:t>)</w:t>
+      </w:r>
+    </w:p>
+    <w:p>
+      <w:pPr>
+        <w:numPr>
+          <w:ilvl w:val="0"/>
+          <w:numId w:val="4"/>
+        </w:numPr>
+      </w:pPr>
+      <w:r>
+        <w:rPr>
+          <w:b/>
+          <w:bCs/>
+        </w:rPr>
+        <w:t>Java Fundamentos</w:t>
+      </w:r>
+      <w:r>
+        <w:t xml:space="preserve"> – FIAP (2026)</w:t>
+      </w:r>
+    </w:p>
+    <w:p>
+      <w:pPr>
+        <w:numPr>
+          <w:ilvl w:val="0"/>
+          <w:numId w:val="4"/>
+        </w:numPr>
+      </w:pPr>
+      <w:r>
+        <w:rPr>
+          <w:b/>
+          <w:bCs/>
+        </w:rPr>
+        <w:t>Metrologia</w:t>
+      </w:r>
+      <w:r>
+        <w:t xml:space="preserve"> – SENAI (2024)</w:t>
+      </w:r>
+    </w:p>
+    <w:p>
+      <w:pPr>
+        <w:numPr>
+          <w:ilvl w:val="0"/>
+          <w:numId w:val="4"/>
+        </w:numPr>
+      </w:pPr>
+      <w:r>
+        <w:rPr>
+          <w:b/>
+          <w:bCs/>
+        </w:rPr>
+        <w:t>Programação Orientada a Objetos (POO) com C#</w:t>
+      </w:r>
+      <w:r>
+        <w:t xml:space="preserve"> – </w:t>
+      </w:r>
+      <w:proofErr w:type="spellStart"/>
+      <w:r>
+        <w:t>Udemy</w:t>
+      </w:r>
+      <w:proofErr w:type="spellEnd"/>
+      <w:r>
+        <w:t xml:space="preserve"> (Em andamento)</w:t>
       </w:r>
     </w:p>
     <w:p/>
@@ -567,167 +1576,6 @@
     <w:p/>
     <w:p/>
     <w:p/>
-    <w:p>
-      <w:pPr>
-        <w:rPr>
-          <w:u w:val="single"/>
-          <w:lang w:val="en-US"/>
-        </w:rPr>
-      </w:pPr>
-    </w:p>
-    <w:p>
-      <w:pPr>
-        <w:rPr>
-          <w:b/>
-          <w:bCs/>
-          <w:sz w:val="28"/>
-          <w:szCs w:val="28"/>
-        </w:rPr>
-      </w:pPr>
-      <w:r>
-        <w:rPr>
-          <w:b/>
-          <w:bCs/>
-          <w:sz w:val="28"/>
-          <w:szCs w:val="28"/>
-        </w:rPr>
-        <w:lastRenderedPageBreak/>
-        <w:t>CURSOS E CERTIFICAÇÕES</w:t>
-      </w:r>
-    </w:p>
-    <w:p>
-      <w:pPr>
-        <w:numPr>
-          <w:ilvl w:val="0"/>
-          <w:numId w:val="4"/>
-        </w:numPr>
-        <w:rPr>
-          <w:lang w:val="en-US"/>
-        </w:rPr>
-      </w:pPr>
-      <w:r>
-        <w:rPr>
-          <w:b/>
-          <w:bCs/>
-          <w:lang w:val="en-US"/>
-        </w:rPr>
-        <w:t>Introduction to Computer Science with Python (CS50P)</w:t>
-      </w:r>
-      <w:r>
-        <w:rPr>
-          <w:lang w:val="en-US"/>
-        </w:rPr>
-        <w:t xml:space="preserve"> – Harvard University / EdX (2024)</w:t>
-      </w:r>
-    </w:p>
-    <w:p>
-      <w:pPr>
-        <w:numPr>
-          <w:ilvl w:val="0"/>
-          <w:numId w:val="4"/>
-        </w:numPr>
-        <w:rPr>
-          <w:lang w:val="en-US"/>
-        </w:rPr>
-      </w:pPr>
-      <w:r>
-        <w:rPr>
-          <w:b/>
-          <w:bCs/>
-          <w:lang w:val="en-US"/>
-        </w:rPr>
-        <w:t>Introduction to Databases with SQL (CS50SQL)</w:t>
-      </w:r>
-      <w:r>
-        <w:rPr>
-          <w:lang w:val="en-US"/>
-        </w:rPr>
-        <w:t xml:space="preserve"> – Harvard University / EdX (Em </w:t>
-      </w:r>
-      <w:proofErr w:type="spellStart"/>
-      <w:r>
-        <w:rPr>
-          <w:lang w:val="en-US"/>
-        </w:rPr>
-        <w:t>andamento</w:t>
-      </w:r>
-      <w:proofErr w:type="spellEnd"/>
-      <w:r>
-        <w:rPr>
-          <w:lang w:val="en-US"/>
-        </w:rPr>
-        <w:t>)</w:t>
-      </w:r>
-    </w:p>
-    <w:p>
-      <w:pPr>
-        <w:numPr>
-          <w:ilvl w:val="0"/>
-          <w:numId w:val="4"/>
-        </w:numPr>
-      </w:pPr>
-      <w:r>
-        <w:rPr>
-          <w:b/>
-          <w:bCs/>
-        </w:rPr>
-        <w:t>Java Fundamentos</w:t>
-      </w:r>
-      <w:r>
-        <w:t xml:space="preserve"> – FIAP (2026)</w:t>
-      </w:r>
-    </w:p>
-    <w:p>
-      <w:pPr>
-        <w:numPr>
-          <w:ilvl w:val="0"/>
-          <w:numId w:val="4"/>
-        </w:numPr>
-      </w:pPr>
-      <w:r>
-        <w:rPr>
-          <w:b/>
-          <w:bCs/>
-        </w:rPr>
-        <w:t>Metrologia</w:t>
-      </w:r>
-      <w:r>
-        <w:t xml:space="preserve"> – SENAI (2024)</w:t>
-      </w:r>
-    </w:p>
-    <w:p>
-      <w:pPr>
-        <w:numPr>
-          <w:ilvl w:val="0"/>
-          <w:numId w:val="4"/>
-        </w:numPr>
-      </w:pPr>
-      <w:r>
-        <w:rPr>
-          <w:b/>
-          <w:bCs/>
-        </w:rPr>
-        <w:t>Programação Orientada a Objetos (POO) com C#</w:t>
-      </w:r>
-      <w:r>
-        <w:t xml:space="preserve"> – </w:t>
-      </w:r>
-      <w:proofErr w:type="spellStart"/>
-      <w:r>
-        <w:t>Udemy</w:t>
-      </w:r>
-      <w:proofErr w:type="spellEnd"/>
-      <w:r>
-        <w:t xml:space="preserve"> (Em andamento)</w:t>
-      </w:r>
-    </w:p>
-    <w:p>
-      <w:pPr>
-        <w:rPr>
-          <w:lang w:val="en-US"/>
-        </w:rPr>
-      </w:pPr>
-    </w:p>
     <w:p>
       <w:pPr>
         <w:rPr>
@@ -944,6 +1792,155 @@
     </w:lvl>
   </w:abstractNum>
   <w:abstractNum w:abstractNumId="1" w15:restartNumberingAfterBreak="0">
+    <w:nsid w:val="0A1217D9"/>
+    <w:multiLevelType w:val="multilevel"/>
+    <w:tmpl w:val="3B967A74"/>
+    <w:lvl w:ilvl="0">
+      <w:start w:val="1"/>
+      <w:numFmt w:val="bullet"/>
+      <w:lvlText w:val=""/>
+      <w:lvlJc w:val="left"/>
+      <w:pPr>
+        <w:tabs>
+          <w:tab w:val="num" w:pos="720"/>
+        </w:tabs>
+        <w:ind w:left="720" w:hanging="360"/>
+      </w:pPr>
+      <w:rPr>
+        <w:rFonts w:ascii="Symbol" w:hAnsi="Symbol" w:hint="default"/>
+        <w:sz w:val="20"/>
+      </w:rPr>
+    </w:lvl>
+    <w:lvl w:ilvl="1" w:tentative="1">
+      <w:start w:val="1"/>
+      <w:numFmt w:val="bullet"/>
+      <w:lvlText w:val="o"/>
+      <w:lvlJc w:val="left"/>
+      <w:pPr>
+        <w:tabs>
+          <w:tab w:val="num" w:pos="1440"/>
+        </w:tabs>
+        <w:ind w:left="1440" w:hanging="360"/>
+      </w:pPr>
+      <w:rPr>
+        <w:rFonts w:ascii="Courier New" w:hAnsi="Courier New" w:hint="default"/>
+        <w:sz w:val="20"/>
+      </w:rPr>
+    </w:lvl>
+    <w:lvl w:ilvl="2" w:tentative="1">
+      <w:start w:val="1"/>
+      <w:numFmt w:val="bullet"/>
+      <w:lvlText w:val=""/>
+      <w:lvlJc w:val="left"/>
+      <w:pPr>
+        <w:tabs>
+          <w:tab w:val="num" w:pos="2160"/>
+        </w:tabs>
+        <w:ind w:left="2160" w:hanging="360"/>
+      </w:pPr>
+      <w:rPr>
+        <w:rFonts w:ascii="Wingdings" w:hAnsi="Wingdings" w:hint="default"/>
+        <w:sz w:val="20"/>
+      </w:rPr>
+    </w:lvl>
+    <w:lvl w:ilvl="3" w:tentative="1">
+      <w:start w:val="1"/>
+      <w:numFmt w:val="bullet"/>
+      <w:lvlText w:val=""/>
+      <w:lvlJc w:val="left"/>
+      <w:pPr>
+        <w:tabs>
+          <w:tab w:val="num" w:pos="2880"/>
+        </w:tabs>
+        <w:ind w:left="2880" w:hanging="360"/>
+      </w:pPr>
+      <w:rPr>
+        <w:rFonts w:ascii="Wingdings" w:hAnsi="Wingdings" w:hint="default"/>
+        <w:sz w:val="20"/>
+      </w:rPr>
+    </w:lvl>
+    <w:lvl w:ilvl="4" w:tentative="1">
+      <w:start w:val="1"/>
+      <w:numFmt w:val="bullet"/>
+      <w:lvlText w:val=""/>
+      <w:lvlJc w:val="left"/>
+      <w:pPr>
+        <w:tabs>
+          <w:tab w:val="num" w:pos="3600"/>
+        </w:tabs>
+        <w:ind w:left="3600" w:hanging="360"/>
+      </w:pPr>
+      <w:rPr>
+        <w:rFonts w:ascii="Wingdings" w:hAnsi="Wingdings" w:hint="default"/>
+        <w:sz w:val="20"/>
+      </w:rPr>
+    </w:lvl>
+    <w:lvl w:ilvl="5" w:tentative="1">
+      <w:start w:val="1"/>
+      <w:numFmt w:val="bullet"/>
+      <w:lvlText w:val=""/>
+      <w:lvlJc w:val="left"/>
+      <w:pPr>
+        <w:tabs>
+          <w:tab w:val="num" w:pos="4320"/>
+        </w:tabs>
+        <w:ind w:left="4320" w:hanging="360"/>
+      </w:pPr>
+      <w:rPr>
+        <w:rFonts w:ascii="Wingdings" w:hAnsi="Wingdings" w:hint="default"/>
+        <w:sz w:val="20"/>
+      </w:rPr>
+    </w:lvl>
+    <w:lvl w:ilvl="6" w:tentative="1">
+      <w:start w:val="1"/>
+      <w:numFmt w:val="bullet"/>
+      <w:lvlText w:val=""/>
+      <w:lvlJc w:val="left"/>
+      <w:pPr>
+        <w:tabs>
+          <w:tab w:val="num" w:pos="5040"/>
+        </w:tabs>
+        <w:ind w:left="5040" w:hanging="360"/>
+      </w:pPr>
+      <w:rPr>
+        <w:rFonts w:ascii="Wingdings" w:hAnsi="Wingdings" w:hint="default"/>
+        <w:sz w:val="20"/>
+      </w:rPr>
+    </w:lvl>
+    <w:lvl w:ilvl="7" w:tentative="1">
+      <w:start w:val="1"/>
+      <w:numFmt w:val="bullet"/>
+      <w:lvlText w:val=""/>
+      <w:lvlJc w:val="left"/>
+      <w:pPr>
+        <w:tabs>
+          <w:tab w:val="num" w:pos="5760"/>
+        </w:tabs>
+        <w:ind w:left="5760" w:hanging="360"/>
+      </w:pPr>
+      <w:rPr>
+        <w:rFonts w:ascii="Wingdings" w:hAnsi="Wingdings" w:hint="default"/>
+        <w:sz w:val="20"/>
+      </w:rPr>
+    </w:lvl>
+    <w:lvl w:ilvl="8" w:tentative="1">
+      <w:start w:val="1"/>
+      <w:numFmt w:val="bullet"/>
+      <w:lvlText w:val=""/>
+      <w:lvlJc w:val="left"/>
+      <w:pPr>
+        <w:tabs>
+          <w:tab w:val="num" w:pos="6480"/>
+        </w:tabs>
+        <w:ind w:left="6480" w:hanging="360"/>
+      </w:pPr>
+      <w:rPr>
+        <w:rFonts w:ascii="Wingdings" w:hAnsi="Wingdings" w:hint="default"/>
+        <w:sz w:val="20"/>
+      </w:rPr>
+    </w:lvl>
+  </w:abstractNum>
+  <w:abstractNum w:abstractNumId="2" w15:restartNumberingAfterBreak="0">
     <w:nsid w:val="0CAD0B34"/>
     <w:multiLevelType w:val="multilevel"/>
     <w:tmpl w:val="008427C8"/>
@@ -1092,7 +2089,305 @@
       </w:rPr>
     </w:lvl>
   </w:abstractNum>
-  <w:abstractNum w:abstractNumId="2" w15:restartNumberingAfterBreak="0">
+  <w:abstractNum w:abstractNumId="3" w15:restartNumberingAfterBreak="0">
+    <w:nsid w:val="23D14D54"/>
+    <w:multiLevelType w:val="multilevel"/>
+    <w:tmpl w:val="C4C42686"/>
+    <w:lvl w:ilvl="0">
+      <w:start w:val="1"/>
+      <w:numFmt w:val="bullet"/>
+      <w:lvlText w:val=""/>
+      <w:lvlJc w:val="left"/>
+      <w:pPr>
+        <w:tabs>
+          <w:tab w:val="num" w:pos="720"/>
+        </w:tabs>
+        <w:ind w:left="720" w:hanging="360"/>
+      </w:pPr>
+      <w:rPr>
+        <w:rFonts w:ascii="Symbol" w:hAnsi="Symbol" w:hint="default"/>
+        <w:sz w:val="20"/>
+      </w:rPr>
+    </w:lvl>
+    <w:lvl w:ilvl="1" w:tentative="1">
+      <w:start w:val="1"/>
+      <w:numFmt w:val="bullet"/>
+      <w:lvlText w:val="o"/>
+      <w:lvlJc w:val="left"/>
+      <w:pPr>
+        <w:tabs>
+          <w:tab w:val="num" w:pos="1440"/>
+        </w:tabs>
+        <w:ind w:left="1440" w:hanging="360"/>
+      </w:pPr>
+      <w:rPr>
+        <w:rFonts w:ascii="Courier New" w:hAnsi="Courier New" w:hint="default"/>
+        <w:sz w:val="20"/>
+      </w:rPr>
+    </w:lvl>
+    <w:lvl w:ilvl="2" w:tentative="1">
+      <w:start w:val="1"/>
+      <w:numFmt w:val="bullet"/>
+      <w:lvlText w:val=""/>
+      <w:lvlJc w:val="left"/>
+      <w:pPr>
+        <w:tabs>
+          <w:tab w:val="num" w:pos="2160"/>
+        </w:tabs>
+        <w:ind w:left="2160" w:hanging="360"/>
+      </w:pPr>
+      <w:rPr>
+        <w:rFonts w:ascii="Wingdings" w:hAnsi="Wingdings" w:hint="default"/>
+        <w:sz w:val="20"/>
+      </w:rPr>
+    </w:lvl>
+    <w:lvl w:ilvl="3" w:tentative="1">
+      <w:start w:val="1"/>
+      <w:numFmt w:val="bullet"/>
+      <w:lvlText w:val=""/>
+      <w:lvlJc w:val="left"/>
+      <w:pPr>
+        <w:tabs>
+          <w:tab w:val="num" w:pos="2880"/>
+        </w:tabs>
+        <w:ind w:left="2880" w:hanging="360"/>
+      </w:pPr>
+      <w:rPr>
+        <w:rFonts w:ascii="Wingdings" w:hAnsi="Wingdings" w:hint="default"/>
+        <w:sz w:val="20"/>
+      </w:rPr>
+    </w:lvl>
+    <w:lvl w:ilvl="4" w:tentative="1">
+      <w:start w:val="1"/>
+      <w:numFmt w:val="bullet"/>
+      <w:lvlText w:val=""/>
+      <w:lvlJc w:val="left"/>
+      <w:pPr>
+        <w:tabs>
+          <w:tab w:val="num" w:pos="3600"/>
+        </w:tabs>
+        <w:ind w:left="3600" w:hanging="360"/>
+      </w:pPr>
+      <w:rPr>
+        <w:rFonts w:ascii="Wingdings" w:hAnsi="Wingdings" w:hint="default"/>
+        <w:sz w:val="20"/>
+      </w:rPr>
+    </w:lvl>
+    <w:lvl w:ilvl="5" w:tentative="1">
+      <w:start w:val="1"/>
+      <w:numFmt w:val="bullet"/>
+      <w:lvlText w:val=""/>
+      <w:lvlJc w:val="left"/>
+      <w:pPr>
+        <w:tabs>
+          <w:tab w:val="num" w:pos="4320"/>
+        </w:tabs>
+        <w:ind w:left="4320" w:hanging="360"/>
+      </w:pPr>
+      <w:rPr>
+        <w:rFonts w:ascii="Wingdings" w:hAnsi="Wingdings" w:hint="default"/>
+        <w:sz w:val="20"/>
+      </w:rPr>
+    </w:lvl>
+    <w:lvl w:ilvl="6" w:tentative="1">
+      <w:start w:val="1"/>
+      <w:numFmt w:val="bullet"/>
+      <w:lvlText w:val=""/>
+      <w:lvlJc w:val="left"/>
+      <w:pPr>
+        <w:tabs>
+          <w:tab w:val="num" w:pos="5040"/>
+        </w:tabs>
+        <w:ind w:left="5040" w:hanging="360"/>
+      </w:pPr>
+      <w:rPr>
+        <w:rFonts w:ascii="Wingdings" w:hAnsi="Wingdings" w:hint="default"/>
+        <w:sz w:val="20"/>
+      </w:rPr>
+    </w:lvl>
+    <w:lvl w:ilvl="7" w:tentative="1">
+      <w:start w:val="1"/>
+      <w:numFmt w:val="bullet"/>
+      <w:lvlText w:val=""/>
+      <w:lvlJc w:val="left"/>
+      <w:pPr>
+        <w:tabs>
+          <w:tab w:val="num" w:pos="5760"/>
+        </w:tabs>
+        <w:ind w:left="5760" w:hanging="360"/>
+      </w:pPr>
+      <w:rPr>
+        <w:rFonts w:ascii="Wingdings" w:hAnsi="Wingdings" w:hint="default"/>
+        <w:sz w:val="20"/>
+      </w:rPr>
+    </w:lvl>
+    <w:lvl w:ilvl="8" w:tentative="1">
+      <w:start w:val="1"/>
+      <w:numFmt w:val="bullet"/>
+      <w:lvlText w:val=""/>
+      <w:lvlJc w:val="left"/>
+      <w:pPr>
+        <w:tabs>
+          <w:tab w:val="num" w:pos="6480"/>
+        </w:tabs>
+        <w:ind w:left="6480" w:hanging="360"/>
+      </w:pPr>
+      <w:rPr>
+        <w:rFonts w:ascii="Wingdings" w:hAnsi="Wingdings" w:hint="default"/>
+        <w:sz w:val="20"/>
+      </w:rPr>
+    </w:lvl>
+  </w:abstractNum>
+  <w:abstractNum w:abstractNumId="4" w15:restartNumberingAfterBreak="0">
+    <w:nsid w:val="3CF011EA"/>
+    <w:multiLevelType w:val="multilevel"/>
+    <w:tmpl w:val="F2C6461C"/>
+    <w:lvl w:ilvl="0">
+      <w:start w:val="1"/>
+      <w:numFmt w:val="bullet"/>
+      <w:lvlText w:val=""/>
+      <w:lvlJc w:val="left"/>
+      <w:pPr>
+        <w:tabs>
+          <w:tab w:val="num" w:pos="720"/>
+        </w:tabs>
+        <w:ind w:left="720" w:hanging="360"/>
+      </w:pPr>
+      <w:rPr>
+        <w:rFonts w:ascii="Symbol" w:hAnsi="Symbol" w:hint="default"/>
+        <w:sz w:val="20"/>
+      </w:rPr>
+    </w:lvl>
+    <w:lvl w:ilvl="1" w:tentative="1">
+      <w:start w:val="1"/>
+      <w:numFmt w:val="bullet"/>
+      <w:lvlText w:val="o"/>
+      <w:lvlJc w:val="left"/>
+      <w:pPr>
+        <w:tabs>
+          <w:tab w:val="num" w:pos="1440"/>
+        </w:tabs>
+        <w:ind w:left="1440" w:hanging="360"/>
+      </w:pPr>
+      <w:rPr>
+        <w:rFonts w:ascii="Courier New" w:hAnsi="Courier New" w:hint="default"/>
+        <w:sz w:val="20"/>
+      </w:rPr>
+    </w:lvl>
+    <w:lvl w:ilvl="2" w:tentative="1">
+      <w:start w:val="1"/>
+      <w:numFmt w:val="bullet"/>
+      <w:lvlText w:val=""/>
+      <w:lvlJc w:val="left"/>
+      <w:pPr>
+        <w:tabs>
+          <w:tab w:val="num" w:pos="2160"/>
+        </w:tabs>
+        <w:ind w:left="2160" w:hanging="360"/>
+      </w:pPr>
+      <w:rPr>
+        <w:rFonts w:ascii="Wingdings" w:hAnsi="Wingdings" w:hint="default"/>
+        <w:sz w:val="20"/>
+      </w:rPr>
+    </w:lvl>
+    <w:lvl w:ilvl="3" w:tentative="1">
+      <w:start w:val="1"/>
+      <w:numFmt w:val="bullet"/>
+      <w:lvlText w:val=""/>
+      <w:lvlJc w:val="left"/>
+      <w:pPr>
+        <w:tabs>
+          <w:tab w:val="num" w:pos="2880"/>
+        </w:tabs>
+        <w:ind w:left="2880" w:hanging="360"/>
+      </w:pPr>
+      <w:rPr>
+        <w:rFonts w:ascii="Wingdings" w:hAnsi="Wingdings" w:hint="default"/>
+        <w:sz w:val="20"/>
+      </w:rPr>
+    </w:lvl>
+    <w:lvl w:ilvl="4" w:tentative="1">
+      <w:start w:val="1"/>
+      <w:numFmt w:val="bullet"/>
+      <w:lvlText w:val=""/>
+      <w:lvlJc w:val="left"/>
+      <w:pPr>
+        <w:tabs>
+          <w:tab w:val="num" w:pos="3600"/>
+        </w:tabs>
+        <w:ind w:left="3600" w:hanging="360"/>
+      </w:pPr>
+      <w:rPr>
+        <w:rFonts w:ascii="Wingdings" w:hAnsi="Wingdings" w:hint="default"/>
+        <w:sz w:val="20"/>
+      </w:rPr>
+    </w:lvl>
+    <w:lvl w:ilvl="5" w:tentative="1">
+      <w:start w:val="1"/>
+      <w:numFmt w:val="bullet"/>
+      <w:lvlText w:val=""/>
+      <w:lvlJc w:val="left"/>
+      <w:pPr>
+        <w:tabs>
+          <w:tab w:val="num" w:pos="4320"/>
+        </w:tabs>
+        <w:ind w:left="4320" w:hanging="360"/>
+      </w:pPr>
+      <w:rPr>
+        <w:rFonts w:ascii="Wingdings" w:hAnsi="Wingdings" w:hint="default"/>
+        <w:sz w:val="20"/>
+      </w:rPr>
+    </w:lvl>
+    <w:lvl w:ilvl="6" w:tentative="1">
+      <w:start w:val="1"/>
+      <w:numFmt w:val="bullet"/>
+      <w:lvlText w:val=""/>
+      <w:lvlJc w:val="left"/>
+      <w:pPr>
+        <w:tabs>
+          <w:tab w:val="num" w:pos="5040"/>
+        </w:tabs>
+        <w:ind w:left="5040" w:hanging="360"/>
+      </w:pPr>
+      <w:rPr>
+        <w:rFonts w:ascii="Wingdings" w:hAnsi="Wingdings" w:hint="default"/>
+        <w:sz w:val="20"/>
+      </w:rPr>
+    </w:lvl>
+    <w:lvl w:ilvl="7" w:tentative="1">
+      <w:start w:val="1"/>
+      <w:numFmt w:val="bullet"/>
+      <w:lvlText w:val=""/>
+      <w:lvlJc w:val="left"/>
+      <w:pPr>
+        <w:tabs>
+          <w:tab w:val="num" w:pos="5760"/>
+        </w:tabs>
+        <w:ind w:left="5760" w:hanging="360"/>
+      </w:pPr>
+      <w:rPr>
+        <w:rFonts w:ascii="Wingdings" w:hAnsi="Wingdings" w:hint="default"/>
+        <w:sz w:val="20"/>
+      </w:rPr>
+    </w:lvl>
+    <w:lvl w:ilvl="8" w:tentative="1">
+      <w:start w:val="1"/>
+      <w:numFmt w:val="bullet"/>
+      <w:lvlText w:val=""/>
+      <w:lvlJc w:val="left"/>
+      <w:pPr>
+        <w:tabs>
+          <w:tab w:val="num" w:pos="6480"/>
+        </w:tabs>
+        <w:ind w:left="6480" w:hanging="360"/>
+      </w:pPr>
+      <w:rPr>
+        <w:rFonts w:ascii="Wingdings" w:hAnsi="Wingdings" w:hint="default"/>
+        <w:sz w:val="20"/>
+      </w:rPr>
+    </w:lvl>
+  </w:abstractNum>
+  <w:abstractNum w:abstractNumId="5" w15:restartNumberingAfterBreak="0">
     <w:nsid w:val="4DF02EC0"/>
     <w:multiLevelType w:val="multilevel"/>
     <w:tmpl w:val="64CA2D4C"/>
@@ -1241,7 +2536,7 @@
       </w:rPr>
     </w:lvl>
   </w:abstractNum>
-  <w:abstractNum w:abstractNumId="3" w15:restartNumberingAfterBreak="0">
+  <w:abstractNum w:abstractNumId="6" w15:restartNumberingAfterBreak="0">
     <w:nsid w:val="679E6798"/>
     <w:multiLevelType w:val="multilevel"/>
     <w:tmpl w:val="F98E7BEC"/>
@@ -1390,7 +2685,156 @@
       </w:rPr>
     </w:lvl>
   </w:abstractNum>
-  <w:abstractNum w:abstractNumId="4" w15:restartNumberingAfterBreak="0">
+  <w:abstractNum w:abstractNumId="7" w15:restartNumberingAfterBreak="0">
+    <w:nsid w:val="6C5972FC"/>
+    <w:multiLevelType w:val="multilevel"/>
+    <w:tmpl w:val="F2A41E0C"/>
+    <w:lvl w:ilvl="0">
+      <w:start w:val="1"/>
+      <w:numFmt w:val="bullet"/>
+      <w:lvlText w:val=""/>
+      <w:lvlJc w:val="left"/>
+      <w:pPr>
+        <w:tabs>
+          <w:tab w:val="num" w:pos="720"/>
+        </w:tabs>
+        <w:ind w:left="720" w:hanging="360"/>
+      </w:pPr>
+      <w:rPr>
+        <w:rFonts w:ascii="Symbol" w:hAnsi="Symbol" w:hint="default"/>
+        <w:sz w:val="20"/>
+      </w:rPr>
+    </w:lvl>
+    <w:lvl w:ilvl="1" w:tentative="1">
+      <w:start w:val="1"/>
+      <w:numFmt w:val="bullet"/>
+      <w:lvlText w:val="o"/>
+      <w:lvlJc w:val="left"/>
+      <w:pPr>
+        <w:tabs>
+          <w:tab w:val="num" w:pos="1440"/>
+        </w:tabs>
+        <w:ind w:left="1440" w:hanging="360"/>
+      </w:pPr>
+      <w:rPr>
+        <w:rFonts w:ascii="Courier New" w:hAnsi="Courier New" w:hint="default"/>
+        <w:sz w:val="20"/>
+      </w:rPr>
+    </w:lvl>
+    <w:lvl w:ilvl="2" w:tentative="1">
+      <w:start w:val="1"/>
+      <w:numFmt w:val="bullet"/>
+      <w:lvlText w:val=""/>
+      <w:lvlJc w:val="left"/>
+      <w:pPr>
+        <w:tabs>
+          <w:tab w:val="num" w:pos="2160"/>
+        </w:tabs>
+        <w:ind w:left="2160" w:hanging="360"/>
+      </w:pPr>
+      <w:rPr>
+        <w:rFonts w:ascii="Wingdings" w:hAnsi="Wingdings" w:hint="default"/>
+        <w:sz w:val="20"/>
+      </w:rPr>
+    </w:lvl>
+    <w:lvl w:ilvl="3" w:tentative="1">
+      <w:start w:val="1"/>
+      <w:numFmt w:val="bullet"/>
+      <w:lvlText w:val=""/>
+      <w:lvlJc w:val="left"/>
+      <w:pPr>
+        <w:tabs>
+          <w:tab w:val="num" w:pos="2880"/>
+        </w:tabs>
+        <w:ind w:left="2880" w:hanging="360"/>
+      </w:pPr>
+      <w:rPr>
+        <w:rFonts w:ascii="Wingdings" w:hAnsi="Wingdings" w:hint="default"/>
+        <w:sz w:val="20"/>
+      </w:rPr>
+    </w:lvl>
+    <w:lvl w:ilvl="4" w:tentative="1">
+      <w:start w:val="1"/>
+      <w:numFmt w:val="bullet"/>
+      <w:lvlText w:val=""/>
+      <w:lvlJc w:val="left"/>
+      <w:pPr>
+        <w:tabs>
+          <w:tab w:val="num" w:pos="3600"/>
+        </w:tabs>
+        <w:ind w:left="3600" w:hanging="360"/>
+      </w:pPr>
+      <w:rPr>
+        <w:rFonts w:ascii="Wingdings" w:hAnsi="Wingdings" w:hint="default"/>
+        <w:sz w:val="20"/>
+      </w:rPr>
+    </w:lvl>
+    <w:lvl w:ilvl="5" w:tentative="1">
+      <w:start w:val="1"/>
+      <w:numFmt w:val="bullet"/>
+      <w:lvlText w:val=""/>
+      <w:lvlJc w:val="left"/>
+      <w:pPr>
+        <w:tabs>
+          <w:tab w:val="num" w:pos="4320"/>
+        </w:tabs>
+        <w:ind w:left="4320" w:hanging="360"/>
+      </w:pPr>
+      <w:rPr>
+        <w:rFonts w:ascii="Wingdings" w:hAnsi="Wingdings" w:hint="default"/>
+        <w:sz w:val="20"/>
+      </w:rPr>
+    </w:lvl>
+    <w:lvl w:ilvl="6" w:tentative="1">
+      <w:start w:val="1"/>
+      <w:numFmt w:val="bullet"/>
+      <w:lvlText w:val=""/>
+      <w:lvlJc w:val="left"/>
+      <w:pPr>
+        <w:tabs>
+          <w:tab w:val="num" w:pos="5040"/>
+        </w:tabs>
+        <w:ind w:left="5040" w:hanging="360"/>
+      </w:pPr>
+      <w:rPr>
+        <w:rFonts w:ascii="Wingdings" w:hAnsi="Wingdings" w:hint="default"/>
+        <w:sz w:val="20"/>
+      </w:rPr>
+    </w:lvl>
+    <w:lvl w:ilvl="7" w:tentative="1">
+      <w:start w:val="1"/>
+      <w:numFmt w:val="bullet"/>
+      <w:lvlText w:val=""/>
+      <w:lvlJc w:val="left"/>
+      <w:pPr>
+        <w:tabs>
+          <w:tab w:val="num" w:pos="5760"/>
+        </w:tabs>
+        <w:ind w:left="5760" w:hanging="360"/>
+      </w:pPr>
+      <w:rPr>
+        <w:rFonts w:ascii="Wingdings" w:hAnsi="Wingdings" w:hint="default"/>
+        <w:sz w:val="20"/>
+      </w:rPr>
+    </w:lvl>
+    <w:lvl w:ilvl="8" w:tentative="1">
+      <w:start w:val="1"/>
+      <w:numFmt w:val="bullet"/>
+      <w:lvlText w:val=""/>
+      <w:lvlJc w:val="left"/>
+      <w:pPr>
+        <w:tabs>
+          <w:tab w:val="num" w:pos="6480"/>
+        </w:tabs>
+        <w:ind w:left="6480" w:hanging="360"/>
+      </w:pPr>
+      <w:rPr>
+        <w:rFonts w:ascii="Wingdings" w:hAnsi="Wingdings" w:hint="default"/>
+        <w:sz w:val="20"/>
+      </w:rPr>
+    </w:lvl>
+  </w:abstractNum>
+  <w:abstractNum w:abstractNumId="8" w15:restartNumberingAfterBreak="0">
     <w:nsid w:val="6ED81314"/>
     <w:multiLevelType w:val="multilevel"/>
     <w:tmpl w:val="57385044"/>
@@ -1540,19 +2984,31 @@
     </w:lvl>
   </w:abstractNum>
   <w:num w:numId="1" w16cid:durableId="1741904460">
-    <w:abstractNumId w:val="4"/>
+    <w:abstractNumId w:val="8"/>
   </w:num>
   <w:num w:numId="2" w16cid:durableId="1024403053">
-    <w:abstractNumId w:val="3"/>
+    <w:abstractNumId w:val="6"/>
   </w:num>
   <w:num w:numId="3" w16cid:durableId="578098684">
-    <w:abstractNumId w:val="2"/>
+    <w:abstractNumId w:val="5"/>
   </w:num>
   <w:num w:numId="4" w16cid:durableId="1421486819">
-    <w:abstractNumId w:val="1"/>
+    <w:abstractNumId w:val="2"/>
   </w:num>
   <w:num w:numId="5" w16cid:durableId="1121413503">
     <w:abstractNumId w:val="0"/>
+  </w:num>
+  <w:num w:numId="6" w16cid:durableId="604969879">
+    <w:abstractNumId w:val="1"/>
+  </w:num>
+  <w:num w:numId="7" w16cid:durableId="783037462">
+    <w:abstractNumId w:val="3"/>
+  </w:num>
+  <w:num w:numId="8" w16cid:durableId="2034113592">
+    <w:abstractNumId w:val="7"/>
+  </w:num>
+  <w:num w:numId="9" w16cid:durableId="1977250188">
+    <w:abstractNumId w:val="4"/>
   </w:num>
 </w:numbering>
 </file>
@@ -2508,6 +3964,22 @@
       <w:u w:val="single"/>
     </w:rPr>
   </w:style>
+  <w:style w:type="paragraph" w:styleId="NormalWeb">
+    <w:name w:val="Normal (Web)"/>
+    <w:basedOn w:val="Normal"/>
+    <w:uiPriority w:val="99"/>
+    <w:unhideWhenUsed/>
+    <w:rsid w:val="00CE468B"/>
+    <w:pPr>
+      <w:spacing w:before="100" w:beforeAutospacing="1" w:after="100" w:afterAutospacing="1" w:line="240" w:lineRule="auto"/>
+    </w:pPr>
+    <w:rPr>
+      <w:rFonts w:ascii="Times New Roman" w:eastAsia="Times New Roman" w:hAnsi="Times New Roman" w:cs="Times New Roman"/>
+      <w:kern w:val="0"/>
+      <w:lang w:eastAsia="pt-BR"/>
+      <w14:ligatures w14:val="none"/>
+    </w:rPr>
+  </w:style>
 </w:styles>
 </file>
 

</xml_diff>